<commit_message>
Dokumentasi slice 03: jurnal entri 2, laporan pengujian, catatan demo, dan Word
Batas jurnal maksimal lima entri menuntut entri slice 01–03 diisi sekarang,
lengkap dengan angka pagar mutu dan rujukan tanggal-jam ke log mentah. Log
mentah serta dokumen Word diekspor ulang agar juri membaca isi yang sama.

🤖 Generated with Codebuff
Co-Authored-By: Codebuff <noreply@codebuff.com>
</commit_message>
<xml_diff>
--- a/docs/log-mentah/ringkasan-prompt.docx
+++ b/docs/log-mentah/ringkasan-prompt.docx
@@ -104,7 +104,7 @@
         <w:pStyle w:val="ListBullet"/>
       </w:pPr>
       <w:r>
-        <w:t>**Status**: belum terisi — slice 01–03 belum dikerjakan.</w:t>
+        <w:t>**Waktu**: 5 Oktober 2026 ± 19.50 WIB sampai 6 Oktober 2026 09.50 WIB (± 14 jam kerja berselang, termasuk perbaikan pagar mutu).</w:t>
       </w:r>
     </w:p>
     <w:p>
@@ -112,7 +112,31 @@
         <w:pStyle w:val="ListBullet"/>
       </w:pPr>
       <w:r>
-        <w:t>**Rencana isi**: tujuan, prompt inti, hasil, dan rujukan tanggal-jam ke log mentah saat slice 01–03 dikerjakan (login/verifikasi email/guru dari seeder; sekolah, kelas, mapel, murid, impor CSV, pengaturan tiga lapis; bank soal, kuis, tag, soal objektif).</w:t>
+        <w:t>**Tujuan**: mengubah kerangka menjadi fitur asli — (1) auth lengkap (masuk, daftar, verifikasi email, lupa sandi, sesi cookie Sanctum, peran guru/admin/murid, middleware "akun layak"); (2) data induk sekolah, kelas, mapel, murid, impor &amp; ekspor CSV, pengaturan tiga lapis (sekolah → kelas → kuis, dengan kunci sekolah); (3) bank soal + kuis + tag: enam belas berkas backend (registry empat tipe soal objektif, kebijakan akses, validasi kelengkapan publikasi, soal terkunci saat kuis berjalan) dan antarmuka guru/murid (editor soal dengan pratinjau, pengelola kuis dengan jadwal &amp; susun soal, halaman tag, daftar ulangan murid).</w:t>
+      </w:r>
+    </w:p>
+    <w:p>
+      <w:pPr>
+        <w:pStyle w:val="ListBullet"/>
+      </w:pPr>
+      <w:r>
+        <w:t>**Prompt inti (ringkas)**: (a) "mulai fitur asli" — kerjakan slice berikutnya sampai hijau, jangan lompat; (b) "lanjutkan" — slice 02 (sekolah/kelas/mapel/murid/impor CSV/pengaturan); (c) "lanjutkan" lalu "lanjut" — slice 03 (bank soal, kuis, tag, soal objektif), termasuk permintaan UX auth yang menyertai: setelah daftar langsung masuk, pengiriman email jangan mematikan pendaftaran (fail-open), dan tautan verifikasi/reset sandi harus sekali pakai.</w:t>
+      </w:r>
+    </w:p>
+    <w:p>
+      <w:pPr>
+        <w:pStyle w:val="ListBullet"/>
+      </w:pPr>
+      <w:r>
+        <w:t>**Hasil**: commit berurutan `eb5327e` → `82c030c` (slice 01 backend+frontend, slice 02 backend+frontend, dokumentasi, UI baru, slice 03 backend, auth UX, hapus maskot). `./verify.sh` hijau di setiap akhir slice; kondisi terakhir **Pest 59 passed (297 assertions)**, **Pint 139 berkas**, **Vitest 21 berkas/122 test**, **realtime 2 test**, `npm run build` sukses. Bukti perilaku lewat browser sungguhan: smoke CDP slice 02 (login guru; halaman Kelas/Mapel/Murid/Impor/Pengaturan berisi data seeder) dan smoke CDP slice 03 **8/8 lulus** (guru membuat tag + soal lewat formulir, menjadwalkan &amp; menerbitkan kuis, murid membuka kuisnya tanpa melihat kunci jawaban).</w:t>
+      </w:r>
+    </w:p>
+    <w:p>
+      <w:pPr>
+        <w:pStyle w:val="ListBullet"/>
+      </w:pPr>
+      <w:r>
+        <w:t>**Rujukan log mentah**: `log-mentah/2026-10-05-prompt-2.md` — `2026-10-05 ±19:5x WIB` (permintaan "mulai fitur asli"), `2026-10-06 dini hari WIB` (lanjutan slice 01), `2026-10-06 04:54 WIB` (slice 02), `2026-10-06 06:42 WIB` (patch UI baru, smoke CDP, tata ulang Word, revisi mapel tanpa guru pengampu), `2026-10-06 ±07.00–09.49 WIB` (commit bertahap, frontend slice 03, pagar mutu, smoke 8/8).</w:t>
       </w:r>
     </w:p>
     <w:p>

</xml_diff>

<commit_message>
Dokumentasi slice 05: smoke CDP, laporan pengujian, catatan demo, jurnal entri 3, dan Word
Klaim "skor asli tidak pernah berubah" hanya layak dipercaya kalau dibuktikan lewat
perilaku sungguhan, jadi smoke baru membuka browser nyata: guru mengatur saklar,
murid mengerjakan ulang, lalu peringkat diverifikasi memakai attempt_id asli dan
bukan attempt retry. Bukti itu dilengkapi jurnal entri 3 (slice 04-05) yang menyebut
apa yang belum selesai secara jujur, termasuk penyesuaian memory_limit suite dan
peringatan Vite yang masih ada, lalu seluruh dokumen diekspor ulang ke Word.

🤖 Generated with Codebuff
Co-Authored-By: Codebuff <noreply@codebuff.com>
</commit_message>
<xml_diff>
--- a/docs/log-mentah/ringkasan-prompt.docx
+++ b/docs/log-mentah/ringkasan-prompt.docx
@@ -158,7 +158,39 @@
         <w:pStyle w:val="ListBullet"/>
       </w:pPr>
       <w:r>
-        <w:t>**Status**: belum terisi — slice 04–06 belum dikerjakan.</w:t>
+        <w:t>**Waktu**: 6 Oktober 2026 (slice 04 pagi–siang; slice 05 menyusul).</w:t>
+      </w:r>
+    </w:p>
+    <w:p>
+      <w:pPr>
+        <w:pStyle w:val="ListBullet"/>
+      </w:pPr>
+      <w:r>
+        <w:t>**Tujuan**: mengubah kerangka menjadi mesin ulangan sungguhan — murid mengerjakan kuis dengan pengacakan dan autosave, jawaban dinilai server, hasil tampil tanpa kunci; lalu sistem skor yang adil (skor asli permanen, retry terkontrol, ranking dari skor asli, badge per mapel, remedial otomatis, laporan pemahaman per tema/tag).</w:t>
+      </w:r>
+    </w:p>
+    <w:p>
+      <w:pPr>
+        <w:pStyle w:val="ListBullet"/>
+      </w:pPr>
+      <w:r>
+        <w:t>**Prompt inti (ringkas)**: (a) "lanjutkan" — slice 04 (pengerjaan, penilaian objektif, deadline server, submit idempoten, halaman hasil); (b) "lanjutkan" — slice 05 (retry, ranking, badge, remedial, laporan per tag) termasuk permintaan singkat "sudah tau paletnya kan? dan warna yang untuk guru dan murid?" yang dijawab dari `chunks/theme.json`: latar #F8FAFC, sidebar/panel guru #1A2F65, aksen #0EA5E9, pendukung #95A7D5, sorot hangat murid #EEF385 (selalu dengan garis tepi), teks #0F172A, dan mode gelap #0B1530/#14214A — semua hex hanya di blok variabel `theme.css`.</w:t>
+      </w:r>
+    </w:p>
+    <w:p>
+      <w:pPr>
+        <w:pStyle w:val="ListBullet"/>
+      </w:pPr>
+      <w:r>
+        <w:t>**Hasil**: slice 04 — migrasi `attempts`/`answers`, `AttemptService` (mulai/jawab/kumpulkan/`PenilaianObjektif`/`Pengacakan`), layar `/kerjakan/:kuisId` dan `/hasil/:attemptId`; temuan bug zona waktu (jadwal bergeser 7 jam) diperbaiki lewat `keIso()`/`keLokal()`. Slice 05 — kolom `attempt_no`/`asli`, section `Report` (Ranking/Badge/Remedial/LaporanTag), kunci pengaturan baru (`ambang_paham`, `ambang_mulai_paham`, `data_minimum_tag`) dan **ranking bawaan mati**, halaman `/peringkat/:kuisId`, `/kuis/:id/laporan`, `/badge`, `/progres-tema`. Kondisi terakhir: **Pest 79 passed (491 assertions)**, **Pint 166 berkas**, **Vitest 25 berkas/156 test**, **realtime 2 test**, `npm run build` sukses; smoke CDP slice 04 **13/13** dan slice 05 **17/17** lulus. Slice 06 (koreksi manual isian/uraian) belum dikerjakan.</w:t>
+      </w:r>
+    </w:p>
+    <w:p>
+      <w:pPr>
+        <w:pStyle w:val="ListBullet"/>
+      </w:pPr>
+      <w:r>
+        <w:t>**Rujukan log mentah**: `log-mentah/2026-10-05-prompt-2.md` — `2026-10-06 11:10 WIB` (slice 04: backend, verifikasi, frontend, bug jadwal 7 jam, pagar mutu, smoke 13/13) dan `2026-10-06` (slice 05: rintisan diverifikasi, section Report, test 8/100, frontend, `memory_limit` suite, smoke 17/17).</w:t>
       </w:r>
     </w:p>
     <w:p>

</xml_diff>

<commit_message>
Dokumentasi slice 06: laporan pengujian A.9, catatan demo, jurnal, dan log mentah
Selama ini bukti kerja hanya hidup di kepala sesi: laporan pengujian belum
punya bagian slice 06, catatan demo belum memandu alur koreksi manual, jurnal
entri 3 masih menulis slice 06 "belum dikerjakan", dan log mentah berhenti di
slice 05. Semuanya kini mengikuti pekerjaan yang benar-benar dijalankan.

Isi: A.9 (pagar mutu 88/598, 182 berkas Pint, 27 berkas/193 test Vitest, smoke
CDP 27/27, bug angka_persis + perbaikannya, keputusan teknis, yang belum
diuji), Demo Slice 06 untuk guru/murid/guru, jurnal entri 3 diperbarui, log
mentah sesi dilanjutkan, dan skrip smoke-ui-slice06.mjs ditambahkan. Word
diekspor ulang dan isinya diverifikasi dari word/document.xml.

🤖 Generated with Codebuff
Co-Authored-By: Codebuff <noreply@codebuff.com>
</commit_message>
<xml_diff>
--- a/docs/log-mentah/ringkasan-prompt.docx
+++ b/docs/log-mentah/ringkasan-prompt.docx
@@ -158,7 +158,7 @@
         <w:pStyle w:val="ListBullet"/>
       </w:pPr>
       <w:r>
-        <w:t>**Waktu**: 6 Oktober 2026 (slice 04 pagi–siang; slice 05 menyusul).</w:t>
+        <w:t>**Waktu**: 6 Oktober 2026 (slice 04 pagi–siang; slice 05 siang; slice 06 sore, ditutup dengan perbaikan bug penilaian isian).</w:t>
       </w:r>
     </w:p>
     <w:p>
@@ -166,7 +166,7 @@
         <w:pStyle w:val="ListBullet"/>
       </w:pPr>
       <w:r>
-        <w:t>**Tujuan**: mengubah kerangka menjadi mesin ulangan sungguhan — murid mengerjakan kuis dengan pengacakan dan autosave, jawaban dinilai server, hasil tampil tanpa kunci; lalu sistem skor yang adil (skor asli permanen, retry terkontrol, ranking dari skor asli, badge per mapel, remedial otomatis, laporan pemahaman per tema/tag).</w:t>
+        <w:t>**Tujuan**: mengubah kerangka menjadi mesin ulangan sungguhan — murid mengerjakan kuis dengan pengacakan dan autosave, jawaban dinilai server, hasil tampil tanpa kunci; lalu sistem skor yang adil (skor asli permanen, retry terkontrol, ranking dari skor asli, badge per mapel, remedial otomatis, laporan pemahaman per tema/tag); dan akhirnya paket soal lengkap — delapan tipe soal (enam objektif + isian singkat &amp; uraian bertingkat) beserta koreksi manual guru yang teraudit.</w:t>
       </w:r>
     </w:p>
     <w:p>
@@ -174,7 +174,7 @@
         <w:pStyle w:val="ListBullet"/>
       </w:pPr>
       <w:r>
-        <w:t>**Prompt inti (ringkas)**: (a) "lanjutkan" — slice 04 (pengerjaan, penilaian objektif, deadline server, submit idempoten, halaman hasil); (b) "lanjutkan" — slice 05 (retry, ranking, badge, remedial, laporan per tag) termasuk permintaan singkat "sudah tau paletnya kan? dan warna yang untuk guru dan murid?" yang dijawab dari `chunks/theme.json`: latar #F8FAFC, sidebar/panel guru #1A2F65, aksen #0EA5E9, pendukung #95A7D5, sorot hangat murid #EEF385 (selalu dengan garis tepi), teks #0F172A, dan mode gelap #0B1530/#14214A — semua hex hanya di blok variabel `theme.css`.</w:t>
+        <w:t>**Prompt inti (ringkas)**: (a) "lanjutkan" — slice 04 (pengerjaan, penilaian objektif, deadline server, submit idempoten, halaman hasil); (b) "lanjutkan" — slice 05 (retry, ranking, badge, remedial, laporan per tag) termasuk permintaan singkat "sudah tau paletnya kan? dan warna yang untuk guru dan murid?" yang dijawab dari `chunks/theme.json`: latar #F8FAFC, sidebar/panel guru #1A2F65, aksen #0EA5E9, pendukung #95A7D5, sorot hangat murid #EEF385 (selalu dengan garis tepi), teks #0F172A, dan mode gelap #0B1530/#14214A — semua hex hanya di blok variabel `theme.css`; (c) "lanjut" — slice 06 sebagai MVP fitur yang belum ada, dengan arahan pengguna lewat pilihan ganda: "Slice 06: isian/uraian + koreksi manual, semua nya (mvp untuk fitur yang ada ui dan testable namun ketat di pure sys no ui seperti cache dll)", dan "tunda dulu, fokus fitur" untuk bagian deploy.</w:t>
       </w:r>
     </w:p>
     <w:p>
@@ -182,15 +182,7 @@
         <w:pStyle w:val="ListBullet"/>
       </w:pPr>
       <w:r>
-        <w:t>**Hasil**: slice 04 — migrasi `attempts`/`answers`, `AttemptService` (mulai/jawab/kumpulkan/`PenilaianObjektif`/`Pengacakan`), layar `/kerjakan/:kuisId` dan `/hasil/:attemptId`; temuan bug zona waktu (jadwal bergeser 7 jam) diperbaiki lewat `keIso()`/`keLokal()`. Slice 05 — kolom `attempt_no`/`asli`, section `Report` (Ranking/Badge/Remedial/LaporanTag), kunci pengaturan baru (`ambang_paham`, `ambang_mulai_paham`, `data_minimum_tag`) dan **ranking bawaan mati**, halaman `/peringkat/:kuisId`, `/kuis/:id/laporan`, `/badge`, `/progres-tema`. Kondisi terakhir: **Pest 79 passed (491 assertions)**, **Pint 166 berkas**, **Vitest 25 berkas/156 test**, **realtime 2 test**, `npm run build` sukses; smoke CDP slice 04 **13/13** dan slice 05 **17/17** lulus. Slice 06 (koreksi manual isian/uraian) belum dikerjakan.</w:t>
-      </w:r>
-    </w:p>
-    <w:p>
-      <w:pPr>
-        <w:pStyle w:val="ListBullet"/>
-      </w:pPr>
-      <w:r>
-        <w:t>**Rujukan log mentah**: `log-mentah/2026-10-05-prompt-2.md` — `2026-10-06 11:10 WIB` (slice 04: backend, verifikasi, frontend, bug jadwal 7 jam, pagar mutu, smoke 13/13) dan `2026-10-06` (slice 05: rintisan diverifikasi, section Report, test 8/100, frontend, `memory_limit` suite, smoke 17/17).</w:t>
+        <w:t>**Hasil**: slice 04 — migrasi `attempts`/`answers`, `AttemptService` (mulai/jawab/kumpulkan/`PenilaianObjektif`/`Pengacakan`), layar `/kerjakan/:kuisId` dan `/hasil/:attemptId`; temuan bug zona waktu (jadwal bergeser 7 jam) diperbaiki lewat `keIso()`/`keLokal()`. Slice 05 — kolom `attempt_no`/`asli`, section `Report` (Ranking/Badge/Remedial/LaporanTag), kunci pengaturan baru (`ambang_paham`, `ambang_mulai_paham`, `data_minimum_tag`) dan **ranking bawaan mati**, halaman `/peringkat/:kuisId`, `/kuis/:id/laporan`, `/badge`, `/progres-tema`. Slice 06 — registry delapan tipe soal (tambah `letak_kata`, `hubung_kata`, `isian_singkat`, `uraian`), `BantuanTeks`/`PenanganIsianSingkat`/`PenanganUraian` beserta `PenilaianTeks` dan router `PenilaiSoal`, tabel `confirmation_tokens` + kolom `answers.dinilai_manual`/`alasan_koreksi`, `TokenKonfirmasiService` (token hash, 300 detik, sekali pakai) dan `KoreksiService` (antrean → token → koreksi teraudit + `hitungUlang()`), editor soal &amp; renderer untuk empat tipe baru (frontend), serta halaman guru `/kuis/:id/koreksi`. Kondisi terakhir: **Pest 88 passed (598 assertions)**, **Pint 182 berkas**, **Vitest 27 berkas/193 test**, **realtime 2 test**, `npm run build` sukses; smoke CDP slice 04 **13/13**, slice 05 **17/17**, dan slice 06 **27/27** lulus (yang pertama langsung menemukan bug penilaian isian → diperbaiki dan diuji ulang).- **Rujukan log mentah**: `log-mentah/2026-10-05-prompt-2.md` — `2026-10-06 11:10 WIB` (slice 04: backend, verifikasi, frontend, bug jadwal 7 jam, pagar mutu, smoke 13/13), `2026-10-06` (slice 05: rintisan diverifikasi, section Report, test 8/100, frontend, `memory_limit` suite, smoke 17/17), dan `2026-10-06 sore–malam WIB` (slice 06: pusatkan berkas uji, dokumentasi penanda, backend delapan tipe + koreksi manual, frontend editor/renderer/antrean koreksi, penambahan Vitest, smoke 27/27 yang menemukan bug `angka_persis`, sampai ekspor Word dan push).</w:t>
       </w:r>
     </w:p>
     <w:p>

</xml_diff>

<commit_message>
Dokumentasikan putaran audit slice 01 beserta Word-nya
Audit statis atas snapshot zip lama diperiksa ulang terhadap kode berjalan;
bagian A.10 mencatat verdict tiap temuan (mana yang usang, mana yang nyata),
perbaikan yang dikerjakan, dan angka pagar mutu. Satu temuan — pendaftaran
membocorkan email terdaftar lewat 422 — sengaja tidak diubah karena bertabrakan
dengan alur auto-login, dan dicatat terbuka di laporan serta catatan demo agar
juri melihatnya sebagai keputusan sadar, bukan kelalaian. Laporan audit aslinya
diarsipkan utuh di log mentah supaya buktinya tetap ada.

Dokumen Word yang isinya benar-benar berubah diekspor ulang (laporan pengujian,
catatan demo, jurnal, laporan kerja, log mentah, ringkasan prompt); yang hanya
berubah metadata tidak ikut di-commit.

🤖 Generated with Codebuff
Co-Authored-By: Codebuff <noreply@codebuff.com>
</commit_message>
<xml_diff>
--- a/docs/log-mentah/ringkasan-prompt.docx
+++ b/docs/log-mentah/ringkasan-prompt.docx
@@ -182,7 +182,15 @@
         <w:pStyle w:val="ListBullet"/>
       </w:pPr>
       <w:r>
-        <w:t>**Hasil**: slice 04 — migrasi `attempts`/`answers`, `AttemptService` (mulai/jawab/kumpulkan/`PenilaianObjektif`/`Pengacakan`), layar `/kerjakan/:kuisId` dan `/hasil/:attemptId`; temuan bug zona waktu (jadwal bergeser 7 jam) diperbaiki lewat `keIso()`/`keLokal()`. Slice 05 — kolom `attempt_no`/`asli`, section `Report` (Ranking/Badge/Remedial/LaporanTag), kunci pengaturan baru (`ambang_paham`, `ambang_mulai_paham`, `data_minimum_tag`) dan **ranking bawaan mati**, halaman `/peringkat/:kuisId`, `/kuis/:id/laporan`, `/badge`, `/progres-tema`. Slice 06 — registry delapan tipe soal (tambah `letak_kata`, `hubung_kata`, `isian_singkat`, `uraian`), `BantuanTeks`/`PenanganIsianSingkat`/`PenanganUraian` beserta `PenilaianTeks` dan router `PenilaiSoal`, tabel `confirmation_tokens` + kolom `answers.dinilai_manual`/`alasan_koreksi`, `TokenKonfirmasiService` (token hash, 300 detik, sekali pakai) dan `KoreksiService` (antrean → token → koreksi teraudit + `hitungUlang()`), editor soal &amp; renderer untuk empat tipe baru (frontend), serta halaman guru `/kuis/:id/koreksi`. Kondisi terakhir: **Pest 88 passed (598 assertions)**, **Pint 182 berkas**, **Vitest 27 berkas/193 test**, **realtime 2 test**, `npm run build` sukses; smoke CDP slice 04 **13/13**, slice 05 **17/17**, dan slice 06 **27/27** lulus (yang pertama langsung menemukan bug penilaian isian → diperbaiki dan diuji ulang).- **Rujukan log mentah**: `log-mentah/2026-10-05-prompt-2.md` — `2026-10-06 11:10 WIB` (slice 04: backend, verifikasi, frontend, bug jadwal 7 jam, pagar mutu, smoke 13/13), `2026-10-06` (slice 05: rintisan diverifikasi, section Report, test 8/100, frontend, `memory_limit` suite, smoke 17/17), dan `2026-10-06 sore–malam WIB` (slice 06: pusatkan berkas uji, dokumentasi penanda, backend delapan tipe + koreksi manual, frontend editor/renderer/antrean koreksi, penambahan Vitest, smoke 27/27 yang menemukan bug `angka_persis`, sampai ekspor Word dan push).</w:t>
+        <w:t>**Hasil**: slice 04 — migrasi `attempts`/`answers`, `AttemptService` (mulai/jawab/kumpulkan/`PenilaianObjektif`/`Pengacakan`), layar `/kerjakan/:kuisId` dan `/hasil/:attemptId`; temuan bug zona waktu (jadwal bergeser 7 jam) diperbaiki lewat `keIso()`/`keLokal()`. Slice 05 — kolom `attempt_no`/`asli`, section `Report` (Ranking/Badge/Remedial/LaporanTag), kunci pengaturan baru (`ambang_paham`, `ambang_mulai_paham`, `data_minimum_tag`) dan **ranking bawaan mati**, halaman `/peringkat/:kuisId`, `/kuis/:id/laporan`, `/badge`, `/progres-tema`. Slice 06 — registry delapan tipe soal (tambah `letak_kata`, `hubung_kata`, `isian_singkat`, `uraian`), `BantuanTeks`/`PenanganIsianSingkat`/`PenanganUraian` beserta `PenilaianTeks` dan router `PenilaiSoal`, tabel `confirmation_tokens` + kolom `answers.dinilai_manual`/`alasan_koreksi`, `TokenKonfirmasiService` (token hash, 300 detik, sekali pakai) dan `KoreksiService` (antrean → token → koreksi teraudit + `hitungUlang()`), editor soal &amp; renderer untuk empat tipe baru (frontend), serta halaman guru `/kuis/:id/koreksi`. Kondisi terakhir: **Pest 88 passed (598 assertions)**, **Pint 182 berkas**, **Vitest 27 berkas/193 test**, **realtime 2 test**, `npm run build` sukses; smoke CDP slice 04 **13/13**, slice 05 **17/17**, dan slice 06 **27/27** lulus (yang pertama langsung menemukan bug penilaian isian → diperbaiki dan diuji ulang). Ditutup dengan **putaran audit library &amp; kualitas kode**: laporan audit dari snapshot zip lama diperiksa ulang terhadap kode berjalan (sebagian temuan ternyata usang), lalu diperbaiki — tautan reset sandi kini benar-benar menuju frontend, akun *suspended* tidak lagi dihidupkan tautan verifikasi, waktu respons login diseragamkan + throttle per-IP, closure rute diganti controller agar `route:cache` jalan, peran punya satu penulis (`User::tetapkanPeran`), arch test controller diperbaiki, klien CSRF frontend di-cache, dan scaffold Tailwind backend dibersihkan (root backend kini mengalihkan ke frontend). Satu temuan (**enumerasi email saat daftar**) sengaja dipertahankan 422 dan dicatat jujur karena berbenturan dengan alur auto-login. Kondisi terakhir: **Pest 95 passed (629 assertions)**, **Pint 183 berkas**, **Vitest 27 berkas/197 test**.</w:t>
+      </w:r>
+    </w:p>
+    <w:p>
+      <w:pPr>
+        <w:pStyle w:val="ListBullet"/>
+      </w:pPr>
+      <w:r>
+        <w:t>**Rujukan log mentah**: `log-mentah/2026-10-05-prompt-2.md` — `2026-10-06 11:10 WIB` (slice 04: backend, verifikasi, frontend, bug jadwal 7 jam, pagar mutu, smoke 13/13), `2026-10-06` (slice 05: rintisan diverifikasi, section Report, test 8/100, frontend, `memory_limit` suite, smoke 17/17), dan `2026-10-06 sore–malam WIB` (slice 06: pusatkan berkas uji, dokumentasi penanda, backend delapan tipe + koreksi manual, frontend editor/renderer/antrean koreksi, penambahan Vitest, smoke 27/27 yang menemukan bug `angka_persis`, sampai ekspor Word dan push), dan `2026-10-06 19:41 WIB` (putaran audit slice 01: prompt "cek" + laporan audit, verdict tiap temuan, keputusan pengguna "semua termasuk B2" dengan trade-off "pertahankan 422 + note jujur", perbaikan backend/frontend, verifikasi akhir 95/629 + 197 test, build, route:cache, root redirect, sampai dokumentasi A.10 dan ekspor Word).</w:t>
       </w:r>
     </w:p>
     <w:p>

</xml_diff>

<commit_message>
Dokumentasikan slice 07 beserta alat audit UI dan Word-nya
Bukti pengujian harus ikut terlihat juri: A.11 memuat Live Monitor dan proteksi,
dan audit-ui.mjs menyediakan pemeriksaan UI yang bisa diulang (murni baca-saja).
Word diekspor ulang agar dokumen kumpulan tidak tertinggal dari berkas kerja.

🤖 Generated with Codebuff
Co-Authored-By: Codebuff <noreply@codebuff.com>
</commit_message>
<xml_diff>
--- a/docs/log-mentah/ringkasan-prompt.docx
+++ b/docs/log-mentah/ringkasan-prompt.docx
@@ -212,7 +212,142 @@
         <w:pStyle w:val="ListBullet"/>
       </w:pPr>
       <w:r>
-        <w:t>**Status**: belum terisi — slice 07–09 belum dikerjakan.</w:t>
+        <w:t>**Waktu**: 6 Oktober 2026, malam (slice 07), setelah putaran audit slice 01 ditutup dan di-push.</w:t>
+      </w:r>
+    </w:p>
+    <w:p>
+      <w:pPr>
+        <w:pStyle w:val="ListBullet"/>
+      </w:pPr>
+      <w:r>
+        <w:t>**Tujuan**: mengubah ulangan agar bisa dipantau dengan jujur — proteksi tiga lapis yang **fail-open** dan</w:t>
+      </w:r>
+    </w:p>
+    <w:p>
+      <w:r>
+        <w:t>default mati, presence yang hemat kuota (tanpa detak jantung), dan Live Monitor guru yang tetap berisi walau</w:t>
+      </w:r>
+    </w:p>
+    <w:p>
+      <w:r>
+        <w:t>service realtime mati.</w:t>
+      </w:r>
+    </w:p>
+    <w:p>
+      <w:pPr>
+        <w:pStyle w:val="ListBullet"/>
+      </w:pPr>
+      <w:r>
+        <w:t>**Prompt inti (ringkas)**: pengguna lebih dulu bertanya "ada fitur yang belum selesai?" (jawaban saya:</w:t>
+      </w:r>
+    </w:p>
+    <w:p>
+      <w:r>
+        <w:t>14 butir, slice 07–10, dengan deploy sebagai satu-satunya yang aturan lomba tandai tidak boleh dipotong),</w:t>
+      </w:r>
+    </w:p>
+    <w:p>
+      <w:r>
+        <w:t>lalu memberi izin: "boleh lanjutkan". Deploy tetap ditunda sesuai permintaan sebelumnya ("tunda dulu, fokus</w:t>
+      </w:r>
+    </w:p>
+    <w:p>
+      <w:r>
+        <w:t>fitur"), jadi yang dikerjakan adalah slice berikutnya secara berurutan: **slice 07**.</w:t>
+      </w:r>
+    </w:p>
+    <w:p>
+      <w:pPr>
+        <w:pStyle w:val="ListBullet"/>
+      </w:pPr>
+      <w:r>
+        <w:t>**Hasil**: section `Cheat` (enum 13 kategori + skor risiko, catatan **append-only**, service tulis/baca/tinjau</w:t>
+      </w:r>
+    </w:p>
+    <w:p>
+      <w:r>
+        <w:t>+ audit) dan `Presence` (kehadiran dari aktivitas normal dengan ambang 45 detik, deteksi sesi ganda, catatan</w:t>
+      </w:r>
+    </w:p>
+    <w:p>
+      <w:r>
+        <w:t>lama tidak aktif, tiket SSE sekali pakai, snapshot Live Monitor); orkestrator klien `useExamSecurity`</w:t>
+      </w:r>
+    </w:p>
+    <w:p>
+      <w:r>
+        <w:t>beserta pengirim kejadian berkelompok (dedupe, antrean offline 200 entri/48 jam, aturan retry), presence</w:t>
+      </w:r>
+    </w:p>
+    <w:p>
+      <w:r>
+        <w:t>ping + `sendBeacon`, dan halaman guru `/kuis/:id/monitor` dengan polling 5 detik sebagai jalur keselamatan</w:t>
+      </w:r>
+    </w:p>
+    <w:p>
+      <w:r>
+        <w:t>plus SSE dari Node bila hidup. Service Node mendapat endpoint `GET /sse/monitor` (tiket dari Redis, `GETDEL`,</w:t>
+      </w:r>
+    </w:p>
+    <w:p>
+      <w:r>
+        <w:t>cek Origin, `X-Accel-Buffering: no`, keepalive). Kondisi terakhir: **Pest 107 passed (740 assertions)**,</w:t>
+      </w:r>
+    </w:p>
+    <w:p>
+      <w:r>
+        <w:t>**Pint 203 berkas**, **Vitest 29 berkas/209 test**, **realtime 9 test**, dan smoke CDP</w:t>
+      </w:r>
+    </w:p>
+    <w:p>
+      <w:r>
+        <w:t>`docs/smoke-ui-slice07.mjs` **21/21 lulus**.</w:t>
+      </w:r>
+    </w:p>
+    <w:p>
+      <w:pPr>
+        <w:pStyle w:val="ListBullet"/>
+      </w:pPr>
+      <w:r>
+        <w:t>**Dua bug nyata yang ditemukan pengujian**: (a) kunci tiket SSE di-prefix Laravel sehingga service Node</w:t>
+      </w:r>
+    </w:p>
+    <w:p>
+      <w:r>
+        <w:t xml:space="preserve">  tidak pernah menemukannya (handshake selalu 401) — diperbaiki dengan koneksi Redis `realtime` tanpa prefix;</w:t>
+      </w:r>
+    </w:p>
+    <w:p>
+      <w:r>
+        <w:t xml:space="preserve">  (b) **menutup layar Live Monitor mematikan seluruh service realtime**, karena pembersihan memanggil</w:t>
+      </w:r>
+    </w:p>
+    <w:p>
+      <w:r>
+        <w:t xml:space="preserve">  `unsubscribe()`/`disconnect()` yang menyisakan promise tanpa penangkap di ioredis — diperbaiki dengan</w:t>
+      </w:r>
+    </w:p>
+    <w:p>
+      <w:r>
+        <w:t xml:space="preserve">  penutupan sekali jalan memakai `quit()` plus test regresi.</w:t>
+      </w:r>
+    </w:p>
+    <w:p>
+      <w:pPr>
+        <w:pStyle w:val="ListBullet"/>
+      </w:pPr>
+      <w:r>
+        <w:t>**Rujukan log mentah**: `log-mentah/2026-10-05-prompt-2.md` — `2026-10-06 ±20.30–22.00 WIB` (pertanyaan</w:t>
+      </w:r>
+    </w:p>
+    <w:p>
+      <w:r>
+        <w:t>"fitur mana yang belum selesai", izin "boleh lanjutkan", backend Cheat + Presence, test 12 baru, frontend</w:t>
+      </w:r>
+    </w:p>
+    <w:p>
+      <w:r>
+        <w:t>security/presence/Live Monitor, SSE Node, smoke 21/21, dua bug di atas, sampai dokumentasi A.11).</w:t>
       </w:r>
     </w:p>
     <w:p>
@@ -234,7 +369,12 @@
         <w:pStyle w:val="ListBullet"/>
       </w:pPr>
       <w:r>
-        <w:t>**Status**: belum terisi — slice 10 belum dikerjakan.</w:t>
+        <w:t>**Status**: belum terisi — slice 08–10 (materi, avatar, tim, upload jawaban, AI, cache, Octane, deploy)</w:t>
+      </w:r>
+    </w:p>
+    <w:p>
+      <w:r>
+        <w:t xml:space="preserve">  belum dikerjakan.</w:t>
       </w:r>
     </w:p>
     <w:sectPr>

</xml_diff>